<commit_message>
Update generated season report with REJECT and rounding fixes applied
</commit_message>
<xml_diff>
--- a/output/season-report.docx
+++ b/output/season-report.docx
@@ -20,7 +20,7 @@
           <w:b w:val="on"/>
           <w:sz w:val="28"/>
         </w:rPr>
-        <w:t>Member: M-0056 - Tako Vine</w:t>
+        <w:t>Member: M-0058 - Tako N</w:t>
       </w:r>
     </w:p>
     <w:tbl>
@@ -83,42 +83,42 @@
         <w:tc>
           <w:p>
             <w:r>
-              <w:t>D-1003</w:t>
-            </w:r>
-          </w:p>
-        </w:tc>
-        <w:tc>
-          <w:p>
-            <w:r>
-              <w:t>TEA</w:t>
-            </w:r>
-          </w:p>
-        </w:tc>
-        <w:tc>
-          <w:p>
-            <w:r>
-              <w:t>123.0</w:t>
-            </w:r>
-          </w:p>
-        </w:tc>
-        <w:tc>
-          <w:p>
-            <w:r>
-              <w:t>A</w:t>
-            </w:r>
-          </w:p>
-        </w:tc>
-        <w:tc>
-          <w:p>
-            <w:r>
-              <w:t>4</w:t>
-            </w:r>
-          </w:p>
-        </w:tc>
-        <w:tc>
-          <w:p>
-            <w:r>
-              <w:t>3,449.38</w:t>
+              <w:t>D-1002</w:t>
+            </w:r>
+          </w:p>
+        </w:tc>
+        <w:tc>
+          <w:p>
+            <w:r>
+              <w:t>BNS</w:t>
+            </w:r>
+          </w:p>
+        </w:tc>
+        <w:tc>
+          <w:p>
+            <w:r>
+              <w:t>453.0</w:t>
+            </w:r>
+          </w:p>
+        </w:tc>
+        <w:tc>
+          <w:p>
+            <w:r>
+              <w:t>C</w:t>
+            </w:r>
+          </w:p>
+        </w:tc>
+        <w:tc>
+          <w:p>
+            <w:r>
+              <w:t>3</w:t>
+            </w:r>
+          </w:p>
+        </w:tc>
+        <w:tc>
+          <w:p>
+            <w:r>
+              <w:t>32,015.78</w:t>
             </w:r>
           </w:p>
         </w:tc>
@@ -126,12 +126,12 @@
     </w:tbl>
     <w:p>
       <w:r>
-        <w:t>Total commission deducted: 194.49 MUR</w:t>
-      </w:r>
-    </w:p>
-    <w:p>
-      <w:r>
-        <w:t>Total transport levy deducted: 246.00 MUR</w:t>
+        <w:t>Total commission deducted: 1,732.73 MUR</w:t>
+      </w:r>
+    </w:p>
+    <w:p>
+      <w:r>
+        <w:t>Total transport levy deducted: 906.00 MUR</w:t>
       </w:r>
     </w:p>
     <w:p>
@@ -140,7 +140,7 @@
           <w:b w:val="on"/>
           <w:sz w:val="26"/>
         </w:rPr>
-        <w:t>NET PAYABLE: 3,449.38 MUR</w:t>
+        <w:t>NET PAYABLE: 32,015.78 MUR</w:t>
       </w:r>
     </w:p>
     <w:p>
@@ -164,7 +164,7 @@
           <w:b w:val="on"/>
           <w:sz w:val="28"/>
         </w:rPr>
-        <w:t>Member: M-0058 - Mama Naelle</w:t>
+        <w:t>Member: M-0062 - Moi Q</w:t>
       </w:r>
     </w:p>
     <w:tbl>
@@ -227,21 +227,21 @@
         <w:tc>
           <w:p>
             <w:r>
-              <w:t>D-1004</w:t>
-            </w:r>
-          </w:p>
-        </w:tc>
-        <w:tc>
-          <w:p>
-            <w:r>
-              <w:t>BNS</w:t>
-            </w:r>
-          </w:p>
-        </w:tc>
-        <w:tc>
-          <w:p>
-            <w:r>
-              <w:t>234.0</w:t>
+              <w:t>D-1003</w:t>
+            </w:r>
+          </w:p>
+        </w:tc>
+        <w:tc>
+          <w:p>
+            <w:r>
+              <w:t>POT</w:t>
+            </w:r>
+          </w:p>
+        </w:tc>
+        <w:tc>
+          <w:p>
+            <w:r>
+              <w:t>231.0</w:t>
             </w:r>
           </w:p>
         </w:tc>
@@ -255,7 +255,7 @@
         <w:tc>
           <w:p>
             <w:r>
-              <w:t>3</w:t>
+              <w:t>6</w:t>
             </w:r>
           </w:p>
         </w:tc>
@@ -275,7 +275,7 @@
     </w:p>
     <w:p>
       <w:r>
-        <w:t>Total transport levy deducted: 468.00 MUR</w:t>
+        <w:t>Total transport levy deducted: 0.00 MUR</w:t>
       </w:r>
     </w:p>
     <w:p>
@@ -308,7 +308,7 @@
           <w:b w:val="on"/>
           <w:sz w:val="28"/>
         </w:rPr>
-        <w:t>Member: M-0052 - Nelly Mizero</w:t>
+        <w:t>Member: M-0042 - Nelly T</w:t>
       </w:r>
     </w:p>
     <w:tbl>
@@ -385,7 +385,7 @@
         <w:tc>
           <w:p>
             <w:r>
-              <w:t>245.0</w:t>
+              <w:t>234.0</w:t>
             </w:r>
           </w:p>
         </w:tc>
@@ -399,58 +399,14 @@
         <w:tc>
           <w:p>
             <w:r>
-              <w:t>6</w:t>
-            </w:r>
-          </w:p>
-        </w:tc>
-        <w:tc>
-          <w:p>
-            <w:r>
-              <w:t>7,539.88</w:t>
-            </w:r>
-          </w:p>
-        </w:tc>
-      </w:tr>
-      <w:tr>
-        <w:tc>
-          <w:p>
-            <w:r>
-              <w:t>D-1002</w:t>
-            </w:r>
-          </w:p>
-        </w:tc>
-        <w:tc>
-          <w:p>
-            <w:r>
-              <w:t>POT</w:t>
-            </w:r>
-          </w:p>
-        </w:tc>
-        <w:tc>
-          <w:p>
-            <w:r>
-              <w:t>312.0</w:t>
-            </w:r>
-          </w:p>
-        </w:tc>
-        <w:tc>
-          <w:p>
-            <w:r>
-              <w:t>A</w:t>
-            </w:r>
-          </w:p>
-        </w:tc>
-        <w:tc>
-          <w:p>
-            <w:r>
-              <w:t>5</w:t>
-            </w:r>
-          </w:p>
-        </w:tc>
-        <w:tc>
-          <w:p>
-            <w:r>
-              <w:t>13,180.83</w:t>
+              <w:t>8</w:t>
+            </w:r>
+          </w:p>
+        </w:tc>
+        <w:tc>
+          <w:p>
+            <w:r>
+              <w:t>7,201.35</w:t>
             </w:r>
           </w:p>
         </w:tc>
@@ -458,12 +414,12 @@
     </w:tbl>
     <w:p>
       <w:r>
-        <w:t>Total commission deducted: 1,149.20 MUR</w:t>
-      </w:r>
-    </w:p>
-    <w:p>
-      <w:r>
-        <w:t>Total transport levy deducted: 1,114.00 MUR</w:t>
+        <w:t>Total commission deducted: 403.65 MUR</w:t>
+      </w:r>
+    </w:p>
+    <w:p>
+      <w:r>
+        <w:t>Total transport levy deducted: 468.00 MUR</w:t>
       </w:r>
     </w:p>
     <w:p>
@@ -472,7 +428,7 @@
           <w:b w:val="on"/>
           <w:sz w:val="26"/>
         </w:rPr>
-        <w:t>NET PAYABLE: 20,720.70 MUR</w:t>
+        <w:t>NET PAYABLE: 7,201.35 MUR</w:t>
       </w:r>
     </w:p>
     <w:p>
@@ -506,7 +462,7 @@
     </w:p>
     <w:p>
       <w:r>
-        <w:t>Number of deliveries: 4</w:t>
+        <w:t>Number of deliveries: 3</w:t>
       </w:r>
     </w:p>
     <w:p>
@@ -515,7 +471,7 @@
           <w:b w:val="on"/>
           <w:sz w:val="26"/>
         </w:rPr>
-        <w:t>TOTAL SEASON PAYOUT: 24,170.09 MUR</w:t>
+        <w:t>TOTAL SEASON PAYOUT: 39,217.13 MUR</w:t>
       </w:r>
     </w:p>
   </w:body>

</xml_diff>